<commit_message>
v1.11.7: Edge Add-ons guide + full docs refresh for the 1.11 arc
EDGE_LISTING.md (submission checklist, permission justifications, Edge
listing copy — package is Edge-ready as-is). README + STORE_LISTING cover
all new modules and refreshed stats. All 6 Office docs regenerated with the
14-module map, new training chapter, spec rows, v1.11.7 stamps.

Co-Authored-By: Claude Opus 4.8 (1M context) <noreply@anthropic.com>
</commit_message>
<xml_diff>
--- a/docs/Colvio_Guide_Formation.docx
+++ b/docs/Colvio_Guide_Formation.docx
@@ -63,7 +63,7 @@
           <w:sz w:val="22"/>
           <w:szCs w:val="22"/>
         </w:rPr>
-        <w:t xml:space="preserve">v1.10.26  ·  Juin 2026</w:t>
+        <w:t xml:space="preserve">v1.11.7  ·  Juin 2026</w:t>
       </w:r>
     </w:p>
     <w:p>
@@ -199,10 +199,10 @@
           <w:b/>
           <w:bCs/>
         </w:rPr>
-        <w:t xml:space="preserve">12 modules</w:t>
-      </w:r>
-      <w:r>
-        <w:t xml:space="preserve"> couvrant l'exploration, le chargement de données, le test d'API et l'audit.</w:t>
+        <w:t xml:space="preserve">14 modules</w:t>
+      </w:r>
+      <w:r>
+        <w:t xml:space="preserve"> couvrant l'exploration, la restauration, le chargement de données, le test d'API et l'audit.</w:t>
       </w:r>
     </w:p>
     <w:p>
@@ -236,7 +236,7 @@
       <w:r>
         <w:drawing>
           <wp:inline distT="0" distB="0" distL="0" distR="0">
-            <wp:extent cx="5905500" cy="3028950"/>
+            <wp:extent cx="5905500" cy="3362325"/>
             <wp:effectExtent t="0" r="0" b="0" l="0"/>
             <wp:docPr id="1" name="modules.png" descr="Colvio modules" title="Colvio modules"/>
             <wp:cNvGraphicFramePr>
@@ -261,7 +261,7 @@
                   <pic:spPr bwMode="auto">
                     <a:xfrm>
                       <a:off x="0" y="0"/>
-                      <a:ext cx="5905500" cy="3028950"/>
+                      <a:ext cx="5905500" cy="3362325"/>
                     </a:xfrm>
                     <a:prstGeom prst="rect">
                       <a:avLst/>
@@ -2680,6 +2680,176 @@
         <w:pStyle w:val="Heading1"/>
       </w:pPr>
       <w:r>
+        <w:t xml:space="preserve">6 bis. Filet de sécurité et nouveaux modules</w:t>
+      </w:r>
+    </w:p>
+    <w:p>
+      <w:pPr>
+        <w:pStyle w:val="Heading2"/>
+      </w:pPr>
+      <w:r>
+        <w:t xml:space="preserve">Dry run, Rollback, Delta</w:t>
+      </w:r>
+    </w:p>
+    <w:p>
+      <w:pPr>
+        <w:spacing w:after="120"/>
+      </w:pPr>
+      <w:r>
+        <w:t xml:space="preserve">Avant un chargement risqué : </w:t>
+      </w:r>
+      <w:r>
+        <w:rPr>
+          <w:b/>
+          <w:bCs/>
+        </w:rPr>
+        <w:t xml:space="preserve">Dry run</w:t>
+      </w:r>
+      <w:r>
+        <w:t xml:space="preserve"> simule tout l'import sans rien écrire et rapporte ligne par ligne ce qu'un vrai run ferait. Après un run de création : </w:t>
+      </w:r>
+      <w:r>
+        <w:rPr>
+          <w:b/>
+          <w:bCs/>
+        </w:rPr>
+        <w:t xml:space="preserve">Rollback</w:t>
+      </w:r>
+      <w:r>
+        <w:t xml:space="preserve"> supprime exactement les enregistrements créés (GUID capturés des réponses batch), confirmation tapée. Sur les synchros récurrentes : </w:t>
+      </w:r>
+      <w:r>
+        <w:rPr>
+          <w:b/>
+          <w:bCs/>
+        </w:rPr>
+        <w:t xml:space="preserve">Delta mode</w:t>
+      </w:r>
+      <w:r>
+        <w:t xml:space="preserve"> lit d'abord les valeurs actuelles et n'envoie que les champs réellement modifiés — les lignes inchangées sont sautées (statut UNCHANGED).</w:t>
+      </w:r>
+    </w:p>
+    <w:p>
+      <w:pPr>
+        <w:pStyle w:val="Heading2"/>
+      </w:pPr>
+      <w:r>
+        <w:t xml:space="preserve">Corbeille (Recycle Bin)</w:t>
+      </w:r>
+    </w:p>
+    <w:p>
+      <w:pPr>
+        <w:spacing w:after="120"/>
+      </w:pPr>
+      <w:r>
+        <w:t xml:space="preserve">Liste et </w:t>
+      </w:r>
+      <w:r>
+        <w:rPr>
+          <w:b/>
+          <w:bCs/>
+        </w:rPr>
+        <w:t xml:space="preserve">restaure les enregistrements supprimés</w:t>
+      </w:r>
+      <w:r>
+        <w:t xml:space="preserve"> (restauration serveur réelle, valeurs d'origine) quand l'option d'org « Conserver les enregistrements supprimés » est active (rétention 1-30 jours). Limitations Microsoft affichées dans le module : suppressions antérieures à l'activation, tables virtuelles/élastiques/composants, tables de plus de 600 colonnes, ordre des cascades, conflits de clés.</w:t>
+      </w:r>
+    </w:p>
+    <w:p>
+      <w:pPr>
+        <w:pStyle w:val="Heading2"/>
+      </w:pPr>
+      <w:r>
+        <w:t xml:space="preserve">Historique des modifications</w:t>
+      </w:r>
+    </w:p>
+    <w:p>
+      <w:pPr>
+        <w:spacing w:after="120"/>
+      </w:pPr>
+      <w:r>
+        <w:t xml:space="preserve">Dans Show All Data, chaque enregistrement a un panneau </w:t>
+      </w:r>
+      <w:r>
+        <w:rPr>
+          <w:b/>
+          <w:bCs/>
+        </w:rPr>
+        <w:t xml:space="preserve">Historique</w:t>
+      </w:r>
+      <w:r>
+        <w:t xml:space="preserve"> : timeline d'audit (qui, quand, action) et diff champ par champ (ancienne → nouvelle valeur). Nécessite l'audit activé (org + table).</w:t>
+      </w:r>
+    </w:p>
+    <w:p>
+      <w:pPr>
+        <w:pStyle w:val="Heading2"/>
+      </w:pPr>
+      <w:r>
+        <w:t xml:space="preserve">System Ops</w:t>
+      </w:r>
+    </w:p>
+    <w:p>
+      <w:pPr>
+        <w:spacing w:after="120"/>
+      </w:pPr>
+      <w:r>
+        <w:rPr>
+          <w:b/>
+          <w:bCs/>
+        </w:rPr>
+        <w:t xml:space="preserve">Jobs système</w:t>
+      </w:r>
+      <w:r>
+        <w:t xml:space="preserve"> : filtres rapides (échoués, en attente, en cours), annulation/reprise en masse pour les admins — les jobs de maintenance plateforme ne sont pas annulables. </w:t>
+      </w:r>
+      <w:r>
+        <w:rPr>
+          <w:b/>
+          <w:bCs/>
+        </w:rPr>
+        <w:t xml:space="preserve">Traces plug-ins</w:t>
+      </w:r>
+      <w:r>
+        <w:t xml:space="preserve"> : exceptions en évidence, texte complet (plafond 10 Ko), export CSV ; purge auto ~24 h.</w:t>
+      </w:r>
+    </w:p>
+    <w:p>
+      <w:pPr>
+        <w:pStyle w:val="Heading2"/>
+      </w:pPr>
+      <w:r>
+        <w:t xml:space="preserve">Snapshot &amp; diff de schéma</w:t>
+      </w:r>
+    </w:p>
+    <w:p>
+      <w:pPr>
+        <w:spacing w:after="120"/>
+      </w:pPr>
+      <w:r>
+        <w:t xml:space="preserve">Dans le Metadata Browser (bouton ⇄) : exportez le schéma en JSON sur une org, chargez-le sur une autre, et obtenez le </w:t>
+      </w:r>
+      <w:r>
+        <w:rPr>
+          <w:b/>
+          <w:bCs/>
+        </w:rPr>
+        <w:t xml:space="preserve">diff classé</w:t>
+      </w:r>
+      <w:r>
+        <w:t xml:space="preserve"> (tables/colonnes manquantes, types différents) avec export CSV — idéal avant un déploiement DEV → UAT → PROD.</w:t>
+      </w:r>
+    </w:p>
+    <w:p>
+      <w:r>
+        <w:br w:type="page"/>
+      </w:r>
+    </w:p>
+    <w:p>
+      <w:pPr>
+        <w:pStyle w:val="Heading1"/>
+      </w:pPr>
+      <w:r>
         <w:t xml:space="preserve">7. Modéliser : schéma, relations, solutions, traductions</w:t>
       </w:r>
     </w:p>
@@ -3916,7 +4086,7 @@
         <w:sz w:val="17"/>
         <w:szCs w:val="17"/>
       </w:rPr>
-      <w:t xml:space="preserve">Colvio v1.10.26 — Guide de formation  —  </w:t>
+      <w:t xml:space="preserve">Colvio v1.11.7 — Guide de formation  —  </w:t>
     </w:r>
     <w:r>
       <w:rPr>

</xml_diff>

<commit_message>
v1.11.7: Edge guide + docs refresh (#41)
EDGE_LISTING.md (submission checklist, permission justifications, Edge
listing copy — package is Edge-ready as-is). README + STORE_LISTING cover
all new modules and refreshed stats. All 6 Office docs regenerated with the
14-module map, new training chapter, spec rows, v1.11.7 stamps.

Co-authored-by: Claude Opus 4.8 (1M context) <noreply@anthropic.com>
</commit_message>
<xml_diff>
--- a/docs/Colvio_Guide_Formation.docx
+++ b/docs/Colvio_Guide_Formation.docx
@@ -63,7 +63,7 @@
           <w:sz w:val="22"/>
           <w:szCs w:val="22"/>
         </w:rPr>
-        <w:t xml:space="preserve">v1.10.26  ·  Juin 2026</w:t>
+        <w:t xml:space="preserve">v1.11.7  ·  Juin 2026</w:t>
       </w:r>
     </w:p>
     <w:p>
@@ -199,10 +199,10 @@
           <w:b/>
           <w:bCs/>
         </w:rPr>
-        <w:t xml:space="preserve">12 modules</w:t>
-      </w:r>
-      <w:r>
-        <w:t xml:space="preserve"> couvrant l'exploration, le chargement de données, le test d'API et l'audit.</w:t>
+        <w:t xml:space="preserve">14 modules</w:t>
+      </w:r>
+      <w:r>
+        <w:t xml:space="preserve"> couvrant l'exploration, la restauration, le chargement de données, le test d'API et l'audit.</w:t>
       </w:r>
     </w:p>
     <w:p>
@@ -236,7 +236,7 @@
       <w:r>
         <w:drawing>
           <wp:inline distT="0" distB="0" distL="0" distR="0">
-            <wp:extent cx="5905500" cy="3028950"/>
+            <wp:extent cx="5905500" cy="3362325"/>
             <wp:effectExtent t="0" r="0" b="0" l="0"/>
             <wp:docPr id="1" name="modules.png" descr="Colvio modules" title="Colvio modules"/>
             <wp:cNvGraphicFramePr>
@@ -261,7 +261,7 @@
                   <pic:spPr bwMode="auto">
                     <a:xfrm>
                       <a:off x="0" y="0"/>
-                      <a:ext cx="5905500" cy="3028950"/>
+                      <a:ext cx="5905500" cy="3362325"/>
                     </a:xfrm>
                     <a:prstGeom prst="rect">
                       <a:avLst/>
@@ -2680,6 +2680,176 @@
         <w:pStyle w:val="Heading1"/>
       </w:pPr>
       <w:r>
+        <w:t xml:space="preserve">6 bis. Filet de sécurité et nouveaux modules</w:t>
+      </w:r>
+    </w:p>
+    <w:p>
+      <w:pPr>
+        <w:pStyle w:val="Heading2"/>
+      </w:pPr>
+      <w:r>
+        <w:t xml:space="preserve">Dry run, Rollback, Delta</w:t>
+      </w:r>
+    </w:p>
+    <w:p>
+      <w:pPr>
+        <w:spacing w:after="120"/>
+      </w:pPr>
+      <w:r>
+        <w:t xml:space="preserve">Avant un chargement risqué : </w:t>
+      </w:r>
+      <w:r>
+        <w:rPr>
+          <w:b/>
+          <w:bCs/>
+        </w:rPr>
+        <w:t xml:space="preserve">Dry run</w:t>
+      </w:r>
+      <w:r>
+        <w:t xml:space="preserve"> simule tout l'import sans rien écrire et rapporte ligne par ligne ce qu'un vrai run ferait. Après un run de création : </w:t>
+      </w:r>
+      <w:r>
+        <w:rPr>
+          <w:b/>
+          <w:bCs/>
+        </w:rPr>
+        <w:t xml:space="preserve">Rollback</w:t>
+      </w:r>
+      <w:r>
+        <w:t xml:space="preserve"> supprime exactement les enregistrements créés (GUID capturés des réponses batch), confirmation tapée. Sur les synchros récurrentes : </w:t>
+      </w:r>
+      <w:r>
+        <w:rPr>
+          <w:b/>
+          <w:bCs/>
+        </w:rPr>
+        <w:t xml:space="preserve">Delta mode</w:t>
+      </w:r>
+      <w:r>
+        <w:t xml:space="preserve"> lit d'abord les valeurs actuelles et n'envoie que les champs réellement modifiés — les lignes inchangées sont sautées (statut UNCHANGED).</w:t>
+      </w:r>
+    </w:p>
+    <w:p>
+      <w:pPr>
+        <w:pStyle w:val="Heading2"/>
+      </w:pPr>
+      <w:r>
+        <w:t xml:space="preserve">Corbeille (Recycle Bin)</w:t>
+      </w:r>
+    </w:p>
+    <w:p>
+      <w:pPr>
+        <w:spacing w:after="120"/>
+      </w:pPr>
+      <w:r>
+        <w:t xml:space="preserve">Liste et </w:t>
+      </w:r>
+      <w:r>
+        <w:rPr>
+          <w:b/>
+          <w:bCs/>
+        </w:rPr>
+        <w:t xml:space="preserve">restaure les enregistrements supprimés</w:t>
+      </w:r>
+      <w:r>
+        <w:t xml:space="preserve"> (restauration serveur réelle, valeurs d'origine) quand l'option d'org « Conserver les enregistrements supprimés » est active (rétention 1-30 jours). Limitations Microsoft affichées dans le module : suppressions antérieures à l'activation, tables virtuelles/élastiques/composants, tables de plus de 600 colonnes, ordre des cascades, conflits de clés.</w:t>
+      </w:r>
+    </w:p>
+    <w:p>
+      <w:pPr>
+        <w:pStyle w:val="Heading2"/>
+      </w:pPr>
+      <w:r>
+        <w:t xml:space="preserve">Historique des modifications</w:t>
+      </w:r>
+    </w:p>
+    <w:p>
+      <w:pPr>
+        <w:spacing w:after="120"/>
+      </w:pPr>
+      <w:r>
+        <w:t xml:space="preserve">Dans Show All Data, chaque enregistrement a un panneau </w:t>
+      </w:r>
+      <w:r>
+        <w:rPr>
+          <w:b/>
+          <w:bCs/>
+        </w:rPr>
+        <w:t xml:space="preserve">Historique</w:t>
+      </w:r>
+      <w:r>
+        <w:t xml:space="preserve"> : timeline d'audit (qui, quand, action) et diff champ par champ (ancienne → nouvelle valeur). Nécessite l'audit activé (org + table).</w:t>
+      </w:r>
+    </w:p>
+    <w:p>
+      <w:pPr>
+        <w:pStyle w:val="Heading2"/>
+      </w:pPr>
+      <w:r>
+        <w:t xml:space="preserve">System Ops</w:t>
+      </w:r>
+    </w:p>
+    <w:p>
+      <w:pPr>
+        <w:spacing w:after="120"/>
+      </w:pPr>
+      <w:r>
+        <w:rPr>
+          <w:b/>
+          <w:bCs/>
+        </w:rPr>
+        <w:t xml:space="preserve">Jobs système</w:t>
+      </w:r>
+      <w:r>
+        <w:t xml:space="preserve"> : filtres rapides (échoués, en attente, en cours), annulation/reprise en masse pour les admins — les jobs de maintenance plateforme ne sont pas annulables. </w:t>
+      </w:r>
+      <w:r>
+        <w:rPr>
+          <w:b/>
+          <w:bCs/>
+        </w:rPr>
+        <w:t xml:space="preserve">Traces plug-ins</w:t>
+      </w:r>
+      <w:r>
+        <w:t xml:space="preserve"> : exceptions en évidence, texte complet (plafond 10 Ko), export CSV ; purge auto ~24 h.</w:t>
+      </w:r>
+    </w:p>
+    <w:p>
+      <w:pPr>
+        <w:pStyle w:val="Heading2"/>
+      </w:pPr>
+      <w:r>
+        <w:t xml:space="preserve">Snapshot &amp; diff de schéma</w:t>
+      </w:r>
+    </w:p>
+    <w:p>
+      <w:pPr>
+        <w:spacing w:after="120"/>
+      </w:pPr>
+      <w:r>
+        <w:t xml:space="preserve">Dans le Metadata Browser (bouton ⇄) : exportez le schéma en JSON sur une org, chargez-le sur une autre, et obtenez le </w:t>
+      </w:r>
+      <w:r>
+        <w:rPr>
+          <w:b/>
+          <w:bCs/>
+        </w:rPr>
+        <w:t xml:space="preserve">diff classé</w:t>
+      </w:r>
+      <w:r>
+        <w:t xml:space="preserve"> (tables/colonnes manquantes, types différents) avec export CSV — idéal avant un déploiement DEV → UAT → PROD.</w:t>
+      </w:r>
+    </w:p>
+    <w:p>
+      <w:r>
+        <w:br w:type="page"/>
+      </w:r>
+    </w:p>
+    <w:p>
+      <w:pPr>
+        <w:pStyle w:val="Heading1"/>
+      </w:pPr>
+      <w:r>
         <w:t xml:space="preserve">7. Modéliser : schéma, relations, solutions, traductions</w:t>
       </w:r>
     </w:p>
@@ -3916,7 +4086,7 @@
         <w:sz w:val="17"/>
         <w:szCs w:val="17"/>
       </w:rPr>
-      <w:t xml:space="preserve">Colvio v1.10.26 — Guide de formation  —  </w:t>
+      <w:t xml:space="preserve">Colvio v1.11.7 — Guide de formation  —  </w:t>
     </w:r>
     <w:r>
       <w:rPr>

</xml_diff>